<commit_message>
DONE WORKING FINAL PRODUCT
</commit_message>
<xml_diff>
--- a/Cahier de charges PFA.docx
+++ b/Cahier de charges PFA.docx
@@ -1696,10 +1696,7 @@
         <w:t xml:space="preserve">l’espace de recherche atteint : </w:t>
       </w:r>
       <w:r>
-        <w:t>104,857,600,000,000,000,000,000,000</w:t>
-      </w:r>
-      <w:r>
-        <w:t xml:space="preserve"> combinaisons</w:t>
+        <w:t>104,857,600,000,000,000,000,000,000 combinaisons</w:t>
       </w:r>
     </w:p>
     <w:p>
@@ -2732,10 +2729,7 @@
               <w:cnfStyle w:val="000000000000" w:firstRow="0" w:lastRow="0" w:firstColumn="0" w:lastColumn="0" w:oddVBand="0" w:evenVBand="0" w:oddHBand="0" w:evenHBand="0" w:firstRowFirstColumn="0" w:firstRowLastColumn="0" w:lastRowFirstColumn="0" w:lastRowLastColumn="0"/>
             </w:pPr>
             <w:r>
-              <w:t>Sécurisation par JWT</w:t>
-            </w:r>
-            <w:r>
-              <w:t xml:space="preserve"> et spring </w:t>
+              <w:t xml:space="preserve">Sécurisation par JWT et spring </w:t>
             </w:r>
             <w:r>
               <w:t>Security</w:t>
@@ -3447,12 +3441,15 @@
         <w:keepNext/>
       </w:pPr>
       <w:r>
+        <w:rPr>
+          <w:noProof/>
+        </w:rPr>
         <w:lastRenderedPageBreak/>
         <w:drawing>
-          <wp:inline distT="0" distB="0" distL="0" distR="0" wp14:anchorId="51549B87" wp14:editId="17A3F8D1">
-            <wp:extent cx="5943600" cy="5457190"/>
-            <wp:effectExtent l="0" t="0" r="0" b="0"/>
-            <wp:docPr id="1347668449" name="Picture 1"/>
+          <wp:inline distT="0" distB="0" distL="0" distR="0" wp14:anchorId="4C86D60B" wp14:editId="6BCE30F2">
+            <wp:extent cx="5658640" cy="5953956"/>
+            <wp:effectExtent l="0" t="0" r="0" b="8890"/>
+            <wp:docPr id="709533504" name="Picture 1"/>
             <wp:cNvGraphicFramePr>
               <a:graphicFrameLocks xmlns:a="http://schemas.openxmlformats.org/drawingml/2006/main" noChangeAspect="1"/>
             </wp:cNvGraphicFramePr>
@@ -3460,7 +3457,7 @@
               <a:graphicData uri="http://schemas.openxmlformats.org/drawingml/2006/picture">
                 <pic:pic xmlns:pic="http://schemas.openxmlformats.org/drawingml/2006/picture">
                   <pic:nvPicPr>
-                    <pic:cNvPr id="1347668449" name=""/>
+                    <pic:cNvPr id="709533504" name=""/>
                     <pic:cNvPicPr/>
                   </pic:nvPicPr>
                   <pic:blipFill>
@@ -3472,7 +3469,7 @@
                   <pic:spPr>
                     <a:xfrm>
                       <a:off x="0" y="0"/>
-                      <a:ext cx="5943600" cy="5457190"/>
+                      <a:ext cx="5658640" cy="5953956"/>
                     </a:xfrm>
                     <a:prstGeom prst="rect">
                       <a:avLst/>
@@ -3553,6 +3550,7 @@
     </w:p>
     <w:p>
       <w:r>
+        <w:lastRenderedPageBreak/>
         <w:t xml:space="preserve">Entité </w:t>
       </w:r>
       <w:r>
@@ -3568,7 +3566,6 @@
     </w:p>
     <w:p>
       <w:r>
-        <w:lastRenderedPageBreak/>
         <w:t xml:space="preserve">Entité </w:t>
       </w:r>
       <w:r>
@@ -3629,28 +3626,7 @@
     </w:p>
     <w:p>
       <w:r>
-        <w:t xml:space="preserve">-action_type : </w:t>
-      </w:r>
-      <w:r>
-        <w:t>« </w:t>
-      </w:r>
-      <w:r>
-        <w:t>Add</w:t>
-      </w:r>
-      <w:r>
-        <w:t> »</w:t>
-      </w:r>
-      <w:r>
-        <w:t xml:space="preserve">,  </w:t>
-      </w:r>
-      <w:r>
-        <w:t>« </w:t>
-      </w:r>
-      <w:r>
-        <w:t>Prun</w:t>
-      </w:r>
-      <w:r>
-        <w:t>e » ou « Done »</w:t>
+        <w:t>-action_type : « Add »,  « Prune » ou « Done »</w:t>
       </w:r>
     </w:p>
     <w:p>
@@ -3666,14 +3642,24 @@
     </w:p>
     <w:p>
       <w:pPr>
-        <w:keepNext/>
-      </w:pPr>
-      <w:r>
+        <w:jc w:val="center"/>
+      </w:pPr>
+      <w:r>
+        <w:rPr>
+          <w:noProof/>
+        </w:rPr>
+        <w:lastRenderedPageBreak/>
         <w:drawing>
-          <wp:inline distT="0" distB="0" distL="0" distR="0" wp14:anchorId="0318AB1C" wp14:editId="49193666">
-            <wp:extent cx="5943600" cy="3016885"/>
+          <wp:inline distT="0" distB="0" distL="0" distR="0" wp14:anchorId="55D9CC57" wp14:editId="54168AE4">
+            <wp:extent cx="5943600" cy="5276850"/>
             <wp:effectExtent l="0" t="0" r="0" b="0"/>
-            <wp:docPr id="747057401" name="Picture 1"/>
+            <wp:docPr id="11" name="Picture 10">
+              <a:extLst xmlns:a="http://schemas.openxmlformats.org/drawingml/2006/main">
+                <a:ext uri="{FF2B5EF4-FFF2-40B4-BE49-F238E27FC236}">
+                  <a16:creationId xmlns:a16="http://schemas.microsoft.com/office/drawing/2014/main" id="{DF80B0F3-1EDE-8170-267A-65578563BBB7}"/>
+                </a:ext>
+              </a:extLst>
+            </wp:docPr>
             <wp:cNvGraphicFramePr>
               <a:graphicFrameLocks xmlns:a="http://schemas.openxmlformats.org/drawingml/2006/main" noChangeAspect="1"/>
             </wp:cNvGraphicFramePr>
@@ -3681,8 +3667,16 @@
               <a:graphicData uri="http://schemas.openxmlformats.org/drawingml/2006/picture">
                 <pic:pic xmlns:pic="http://schemas.openxmlformats.org/drawingml/2006/picture">
                   <pic:nvPicPr>
-                    <pic:cNvPr id="747057401" name=""/>
-                    <pic:cNvPicPr/>
+                    <pic:cNvPr id="11" name="Picture 10">
+                      <a:extLst>
+                        <a:ext uri="{FF2B5EF4-FFF2-40B4-BE49-F238E27FC236}">
+                          <a16:creationId xmlns:a16="http://schemas.microsoft.com/office/drawing/2014/main" id="{DF80B0F3-1EDE-8170-267A-65578563BBB7}"/>
+                        </a:ext>
+                      </a:extLst>
+                    </pic:cNvPr>
+                    <pic:cNvPicPr>
+                      <a:picLocks noChangeAspect="1"/>
+                    </pic:cNvPicPr>
                   </pic:nvPicPr>
                   <pic:blipFill>
                     <a:blip r:embed="rId9"/>
@@ -3693,7 +3687,7 @@
                   <pic:spPr>
                     <a:xfrm>
                       <a:off x="0" y="0"/>
-                      <a:ext cx="5943600" cy="3016885"/>
+                      <a:ext cx="5943600" cy="5276850"/>
                     </a:xfrm>
                     <a:prstGeom prst="rect">
                       <a:avLst/>
@@ -3708,6 +3702,11 @@
     </w:p>
     <w:p>
       <w:pPr>
+        <w:keepNext/>
+      </w:pPr>
+    </w:p>
+    <w:p>
+      <w:pPr>
         <w:pStyle w:val="Caption"/>
       </w:pPr>
       <w:r>
@@ -3729,7 +3728,10 @@
         <w:fldChar w:fldCharType="end"/>
       </w:r>
       <w:r>
-        <w:t>:Modéle Physique de données</w:t>
+        <w:t>:</w:t>
+      </w:r>
+      <w:r>
+        <w:t>Diagramme de classes</w:t>
       </w:r>
     </w:p>
     <w:p/>
@@ -3837,11 +3839,14 @@
         <w:keepNext/>
       </w:pPr>
       <w:r>
+        <w:rPr>
+          <w:noProof/>
+        </w:rPr>
         <w:drawing>
-          <wp:inline distT="0" distB="0" distL="0" distR="0" wp14:anchorId="2834857E" wp14:editId="7D8DE482">
-            <wp:extent cx="5943600" cy="2199005"/>
+          <wp:inline distT="0" distB="0" distL="0" distR="0" wp14:anchorId="197DA67A" wp14:editId="4D049E23">
+            <wp:extent cx="5943600" cy="2248535"/>
             <wp:effectExtent l="0" t="0" r="0" b="0"/>
-            <wp:docPr id="280618087" name="Picture 1"/>
+            <wp:docPr id="1762589158" name="Picture 2"/>
             <wp:cNvGraphicFramePr>
               <a:graphicFrameLocks xmlns:a="http://schemas.openxmlformats.org/drawingml/2006/main" noChangeAspect="1"/>
             </wp:cNvGraphicFramePr>
@@ -3849,23 +3854,36 @@
               <a:graphicData uri="http://schemas.openxmlformats.org/drawingml/2006/picture">
                 <pic:pic xmlns:pic="http://schemas.openxmlformats.org/drawingml/2006/picture">
                   <pic:nvPicPr>
-                    <pic:cNvPr id="280618087" name=""/>
-                    <pic:cNvPicPr/>
+                    <pic:cNvPr id="0" name="Picture 2"/>
+                    <pic:cNvPicPr>
+                      <a:picLocks noChangeAspect="1" noChangeArrowheads="1"/>
+                    </pic:cNvPicPr>
                   </pic:nvPicPr>
                   <pic:blipFill>
-                    <a:blip r:embed="rId10"/>
+                    <a:blip r:embed="rId10">
+                      <a:extLst>
+                        <a:ext uri="{28A0092B-C50C-407E-A947-70E740481C1C}">
+                          <a14:useLocalDpi xmlns:a14="http://schemas.microsoft.com/office/drawing/2010/main" val="0"/>
+                        </a:ext>
+                      </a:extLst>
+                    </a:blip>
+                    <a:srcRect/>
                     <a:stretch>
                       <a:fillRect/>
                     </a:stretch>
                   </pic:blipFill>
-                  <pic:spPr>
+                  <pic:spPr bwMode="auto">
                     <a:xfrm>
                       <a:off x="0" y="0"/>
-                      <a:ext cx="5943600" cy="2199005"/>
+                      <a:ext cx="5943600" cy="2248535"/>
                     </a:xfrm>
                     <a:prstGeom prst="rect">
                       <a:avLst/>
                     </a:prstGeom>
+                    <a:noFill/>
+                    <a:ln>
+                      <a:noFill/>
+                    </a:ln>
                   </pic:spPr>
                 </pic:pic>
               </a:graphicData>
@@ -3907,7 +3925,6 @@
       </w:pPr>
       <w:bookmarkStart w:id="16" w:name="_Toc226066524"/>
       <w:r>
-        <w:lastRenderedPageBreak/>
         <w:t>IV Environnement de réalisation</w:t>
       </w:r>
       <w:bookmarkEnd w:id="16"/>
@@ -4021,8 +4038,14 @@
           <w:ilvl w:val="0"/>
           <w:numId w:val="6"/>
         </w:numPr>
-      </w:pPr>
-      <w:r>
+        <w:rPr>
+          <w:lang w:val="en-US"/>
+        </w:rPr>
+      </w:pPr>
+      <w:r>
+        <w:rPr>
+          <w:lang w:val="en-US"/>
+        </w:rPr>
         <w:t>Spring Boot 4 : Orchestrateur de services (Spring Security, Spring Data JPA).</w:t>
       </w:r>
     </w:p>
@@ -4032,8 +4055,14 @@
           <w:ilvl w:val="0"/>
           <w:numId w:val="6"/>
         </w:numPr>
-      </w:pPr>
-      <w:r>
+        <w:rPr>
+          <w:lang w:val="en-US"/>
+        </w:rPr>
+      </w:pPr>
+      <w:r>
+        <w:rPr>
+          <w:lang w:val="en-US"/>
+        </w:rPr>
         <w:t>Flask API : Micro-service Python assurant le Data Streaming (yield).</w:t>
       </w:r>
     </w:p>
@@ -4143,13 +4172,7 @@
     </w:p>
     <w:p>
       <w:r>
-        <w:t xml:space="preserve">Approche Itérative : </w:t>
-      </w:r>
-      <w:r>
-        <w:t>A</w:t>
-      </w:r>
-      <w:r>
-        <w:t>juster les coefficients d'élagage après chaque test de performance.</w:t>
+        <w:t>Approche Itérative : Ajuster les coefficients d'élagage après chaque test de performance.</w:t>
       </w:r>
     </w:p>
     <w:p>
@@ -4160,10 +4183,7 @@
         <w:t>biochimiques et</w:t>
       </w:r>
       <w:r>
-        <w:t xml:space="preserve"> mathématiques</w:t>
-      </w:r>
-      <w:r>
-        <w:t xml:space="preserve"> au fur et à mesure de l'avancement.</w:t>
+        <w:t xml:space="preserve"> mathématiques au fur et à mesure de l'avancement.</w:t>
       </w:r>
     </w:p>
     <w:p/>
@@ -4274,6 +4294,17 @@
             <w:r>
               <w:t>, calcul AUC et vérification de la logique des méthodes</w:t>
             </w:r>
+            <w:r>
+              <w:t>,</w:t>
+            </w:r>
+          </w:p>
+          <w:p>
+            <w:pPr>
+              <w:cnfStyle w:val="000000100000" w:firstRow="0" w:lastRow="0" w:firstColumn="0" w:lastColumn="0" w:oddVBand="0" w:evenVBand="0" w:oddHBand="1" w:evenHBand="0" w:firstRowFirstColumn="0" w:firstRowLastColumn="0" w:lastRowFirstColumn="0" w:lastRowLastColumn="0"/>
+            </w:pPr>
+            <w:r>
+              <w:t>Implémentation de JWT at authentication</w:t>
+            </w:r>
           </w:p>
         </w:tc>
       </w:tr>
@@ -4304,13 +4335,27 @@
               <w:cnfStyle w:val="000000000000" w:firstRow="0" w:lastRow="0" w:firstColumn="0" w:lastColumn="0" w:oddVBand="0" w:evenVBand="0" w:oddHBand="0" w:evenHBand="0" w:firstRowFirstColumn="0" w:firstRowLastColumn="0" w:lastRowFirstColumn="0" w:lastRowLastColumn="0"/>
             </w:pPr>
             <w:r>
-              <w:t xml:space="preserve">Configuration de Spring Boot, mise en place de </w:t>
-            </w:r>
-            <w:r>
-              <w:t>Sp</w:t>
-            </w:r>
-            <w:r>
-              <w:t>ring Security et JWT, création du schéma MySql</w:t>
+              <w:t>Configuration de</w:t>
+            </w:r>
+            <w:r>
+              <w:t>s controlleurs</w:t>
+            </w:r>
+            <w:r>
+              <w:t xml:space="preserve"> et services de génération</w:t>
+            </w:r>
+            <w:r>
+              <w:t xml:space="preserve"> Spring Boot, mise en place d</w:t>
+            </w:r>
+            <w:r>
+              <w:t>’un intercépteur en Angular pour rafraichir les tokens.</w:t>
+            </w:r>
+          </w:p>
+          <w:p>
+            <w:pPr>
+              <w:cnfStyle w:val="000000000000" w:firstRow="0" w:lastRow="0" w:firstColumn="0" w:lastColumn="0" w:oddVBand="0" w:evenVBand="0" w:oddHBand="0" w:evenHBand="0" w:firstRowFirstColumn="0" w:firstRowLastColumn="0" w:lastRowFirstColumn="0" w:lastRowLastColumn="0"/>
+            </w:pPr>
+            <w:r>
+              <w:t>création du schéma MySql</w:t>
             </w:r>
           </w:p>
         </w:tc>
@@ -4359,59 +4404,6 @@
             </w:r>
             <w:r>
               <w:t xml:space="preserve"> des courbes de profils des propriétes et streaming des données pour XAI</w:t>
-            </w:r>
-          </w:p>
-        </w:tc>
-      </w:tr>
-      <w:tr>
-        <w:trPr>
-          <w:trHeight w:val="988"/>
-        </w:trPr>
-        <w:tc>
-          <w:tcPr>
-            <w:cnfStyle w:val="001000000000" w:firstRow="0" w:lastRow="0" w:firstColumn="1" w:lastColumn="0" w:oddVBand="0" w:evenVBand="0" w:oddHBand="0" w:evenHBand="0" w:firstRowFirstColumn="0" w:firstRowLastColumn="0" w:lastRowFirstColumn="0" w:lastRowLastColumn="0"/>
-            <w:tcW w:w="4675" w:type="dxa"/>
-          </w:tcPr>
-          <w:p>
-            <w:pPr>
-              <w:jc w:val="center"/>
-            </w:pPr>
-            <w:r>
-              <w:t>Sprint 4</w:t>
-            </w:r>
-          </w:p>
-        </w:tc>
-        <w:tc>
-          <w:tcPr>
-            <w:tcW w:w="4675" w:type="dxa"/>
-          </w:tcPr>
-          <w:p>
-            <w:pPr>
-              <w:cnfStyle w:val="000000000000" w:firstRow="0" w:lastRow="0" w:firstColumn="0" w:lastColumn="0" w:oddVBand="0" w:evenVBand="0" w:oddHBand="0" w:evenHBand="0" w:firstRowFirstColumn="0" w:firstRowLastColumn="0" w:lastRowFirstColumn="0" w:lastRowLastColumn="0"/>
-            </w:pPr>
-            <w:r>
-              <w:t>Re-</w:t>
-            </w:r>
-            <w:r>
-              <w:t>optimisation</w:t>
-            </w:r>
-            <w:r>
-              <w:t xml:space="preserve"> du module python, Test d’</w:t>
-            </w:r>
-            <w:r>
-              <w:t>intégrations</w:t>
-            </w:r>
-            <w:r>
-              <w:t xml:space="preserve"> et </w:t>
-            </w:r>
-            <w:r>
-              <w:t>finalisation</w:t>
-            </w:r>
-            <w:r>
-              <w:t xml:space="preserve"> de la documentation du </w:t>
-            </w:r>
-            <w:r>
-              <w:t>projet</w:t>
             </w:r>
           </w:p>
         </w:tc>
@@ -6249,6 +6241,7 @@
   <w:style w:type="character" w:default="1" w:styleId="DefaultParagraphFont">
     <w:name w:val="Default Paragraph Font"/>
     <w:uiPriority w:val="1"/>
+    <w:semiHidden/>
     <w:unhideWhenUsed/>
   </w:style>
   <w:style w:type="table" w:default="1" w:styleId="TableNormal">

</xml_diff>